<commit_message>
Rewrite Snapmint PM Seller Experience resume to defensible v2 (EXT66, honest 75%)
Fixes over-tailoring per external critique: revert advisor P&L mislabel, drop
non-defensible seller-commerce terms (order mgmt/KYC/dispute/compliance/seller-exp),
remove 8+2 QA headcount, add portfolio, drop JIRA cert. Titles confirmed as Product roles.

Co-Authored-By: Claude Opus 4.8 <noreply@anthropic.com>
</commit_message>
<xml_diff>
--- a/resumes/Snapmint-Product-Manager-Seller-Experience.docx
+++ b/resumes/Snapmint-Product-Manager-Seller-Experience.docx
@@ -31,7 +31,7 @@
           <w:color w:val="444444"/>
           <w:sz w:val="19"/>
         </w:rPr>
-        <w:t>Product Manager  |  Seller &amp; Supply-Side Experience  |  Two-Sided Marketplace Tools: Onboarding, Catalog, Payouts &amp; Performance  |  Self-Service Dashboards</w:t>
+        <w:t>Product Manager  |  Marketplace &amp; Partner Experience  |  Self-Service Tools, Workflow Automation, Payments &amp; Analytics</w:t>
       </w:r>
     </w:p>
     <w:p>
@@ -124,7 +124,7 @@
           <w:i w:val="0"/>
           <w:sz w:val="19"/>
         </w:rPr>
-        <w:t>Product Manager with 5+ years owning the supply-side (partner/seller) experience on a two-sided marketplace serving 150,000+ users and 30,000+ daily actives — building the onboarding, catalog, payouts, verification, and performance tools that partners run their business on. Rebuilt the partner-facing platform with real-time payout automation and consolidated self-service dashboards, lifting partner NPS from -20 to +40, and shipped workflow automation that cut manual operations 80%. Partners with engineering, operations, and business teams and uses SQL and Power BI to turn data into actionable insights, while keeping seller-facing systems scalable, reliable, and compliant.</w:t>
+        <w:t>Product Manager with 5+ years across scalable partner-facing platforms, workflow automation, payments, catalog/content, and consumer-lifecycle products in a two-sided services marketplace serving 150,000+ users and 30,000+ daily actives. Built teacher/partner-facing self-service tools for onboarding, schedules, payouts, and performance visibility (partner NPS -20 to +40); owned pricing and monetization (25% ARPU growth); and automated verification and enrolment workflows to cut manual operations 80% and save Rs 1.6L/month. Uses SQL and Power BI to turn operating data into product decisions, partnering with engineering, operations, and business teams from discovery through launch.</w:t>
       </w:r>
     </w:p>
     <w:p>
@@ -155,7 +155,7 @@
           <w:i w:val="0"/>
           <w:sz w:val="19"/>
         </w:rPr>
-        <w:t>Seller &amp; Supply-Side Experience · Partner Onboarding &amp; Enablement · Catalog &amp; Content Management · Pricing &amp; Promotions · Payouts &amp; Order Management · KYC, Verification &amp; Compliance · Dispute &amp; Issue Resolution · Self-Service Tools &amp; Dashboards · Performance Insights &amp; Analytics (SQL, Power BI) · Workflow Automation · Two-Sided Marketplace Products · Prioritization (RICE) · Cross-Functional Leadership · Product Management</w:t>
+        <w:t>Partner &amp; Supply-Side Experience · Two-Sided Marketplace Platforms · Partner Onboarding &amp; Self-Service Tools · Payout Automation · Catalog &amp; Content Workflows · Verification &amp; Risk Controls · Performance Dashboards &amp; Insights · Workflow Automation · Pricing, Monetization &amp; Promotions · Product Discovery &amp; Prioritization (RICE) · SQL &amp; Power BI · Cross-Functional Delivery · Product Management</w:t>
       </w:r>
     </w:p>
     <w:p>
@@ -236,7 +236,7 @@
     <w:p>
       <w:pPr>
         <w:pStyle w:val="ListBullet"/>
-        <w:spacing w:after="60" w:before="0" w:line="274" w:lineRule="auto"/>
+        <w:spacing w:after="60" w:before="0" w:line="278" w:lineRule="auto"/>
       </w:pPr>
       <w:r>
         <w:rPr>
@@ -245,13 +245,13 @@
           <w:i w:val="0"/>
           <w:sz w:val="19"/>
         </w:rPr>
-        <w:t>Own the full product suite for a two-sided marketplace of 150,000+ users and 30,000+ daily actives — including the partner/seller-facing platform, content catalog, advisor CRM, and renewal engine — leading a cross-functional squad of 8 engineers and 2 QA from discovery to launch.</w:t>
+        <w:t>Own product strategy, prioritization, and delivery across partner-facing tools, content catalog, CRM, renewal, and customer-support products serving 150,000+ enrolled users and 30,000+ daily active users.</w:t>
       </w:r>
     </w:p>
     <w:p>
       <w:pPr>
         <w:pStyle w:val="ListBullet"/>
-        <w:spacing w:after="60" w:before="0" w:line="274" w:lineRule="auto"/>
+        <w:spacing w:after="60" w:before="0" w:line="278" w:lineRule="auto"/>
       </w:pPr>
       <w:r>
         <w:rPr>
@@ -260,13 +260,13 @@
           <w:i w:val="0"/>
           <w:sz w:val="19"/>
         </w:rPr>
-        <w:t>Built the grade- and course-wise content catalog that partners and users transact through, then automated catalog generation with AI — removing the manual content-operations step that previously gated new listings.</w:t>
+        <w:t>Built a grade- and course-wise content catalog and automated catalog generation with AI, reducing manual content operations and accelerating the launch of new offerings.</w:t>
       </w:r>
     </w:p>
     <w:p>
       <w:pPr>
         <w:pStyle w:val="ListBullet"/>
-        <w:spacing w:after="60" w:before="0" w:line="274" w:lineRule="auto"/>
+        <w:spacing w:after="60" w:before="0" w:line="278" w:lineRule="auto"/>
       </w:pPr>
       <w:r>
         <w:rPr>
@@ -275,13 +275,13 @@
           <w:i w:val="0"/>
           <w:sz w:val="19"/>
         </w:rPr>
-        <w:t>Consolidated support across LMS, email, WhatsApp, and in-app into one helpdesk with a RAG-based AI assistant for issue and dispute resolution — cutting first-response time from 4 minutes to under 10 seconds and monthly escalations from ~300 to under 50 within three months.</w:t>
+        <w:t>Consolidated customer support across LMS, email, WhatsApp, and in-product chat into one helpdesk with a RAG-based assistant, reducing first-response time from four minutes to under ten seconds and monthly escalations from ~300 to under 50.</w:t>
       </w:r>
     </w:p>
     <w:p>
       <w:pPr>
         <w:pStyle w:val="ListBullet"/>
-        <w:spacing w:after="60" w:before="0" w:line="274" w:lineRule="auto"/>
+        <w:spacing w:after="60" w:before="0" w:line="278" w:lineRule="auto"/>
       </w:pPr>
       <w:r>
         <w:rPr>
@@ -290,13 +290,13 @@
           <w:i w:val="0"/>
           <w:sz w:val="19"/>
         </w:rPr>
-        <w:t>Designed an in-product renewal and promotions engine (early-bird access, nudges, free-trial classes) that reduced assisted-renewal cost and generated Rs 70L in product-led renewals in a single month.</w:t>
+        <w:t>Designed a product-led renewal and promotion engine (early-access offers, nudges, trial experiences) that generated Rs 70L in renewals in a single month.</w:t>
       </w:r>
     </w:p>
     <w:p>
       <w:pPr>
         <w:pStyle w:val="ListBullet"/>
-        <w:spacing w:after="60" w:before="0" w:line="274" w:lineRule="auto"/>
+        <w:spacing w:after="60" w:before="0" w:line="278" w:lineRule="auto"/>
       </w:pPr>
       <w:r>
         <w:rPr>
@@ -305,7 +305,7 @@
           <w:i w:val="0"/>
           <w:sz w:val="19"/>
         </w:rPr>
-        <w:t>Built a partner-wise P&amp;L and performance tracker (weekly Net Revenue minus fixed, refund, marketing and sales cost) whose visibility drove interventions — profitable partners rose from 50 to 100 in a month and to 125 over the next two.</w:t>
+        <w:t>Built an advisor-level unit-economics and profitability platform that increased profitable advisors from ~50 to 100 in one month and to 125 over the next two.</w:t>
       </w:r>
     </w:p>
     <w:p>
@@ -340,7 +340,7 @@
     <w:p>
       <w:pPr>
         <w:pStyle w:val="ListBullet"/>
-        <w:spacing w:after="60" w:before="0" w:line="274" w:lineRule="auto"/>
+        <w:spacing w:after="60" w:before="0" w:line="278" w:lineRule="auto"/>
       </w:pPr>
       <w:r>
         <w:rPr>
@@ -349,13 +349,13 @@
           <w:i w:val="0"/>
           <w:sz w:val="19"/>
         </w:rPr>
-        <w:t>Rebuilt the seller/teacher-facing (supply-side) platform with real-time payouts automation, accurate payout summaries, and a consolidated self-service view of CRM, schedules, and performance — lifting partner NPS from -20 to +40.</w:t>
+        <w:t>Rebuilt the teacher-facing partner platform with onboarding, payout automation, accurate payout summaries, and consolidated visibility into schedules and performance — increasing partner NPS from -20 to +40.</w:t>
       </w:r>
     </w:p>
     <w:p>
       <w:pPr>
         <w:pStyle w:val="ListBullet"/>
-        <w:spacing w:after="60" w:before="0" w:line="274" w:lineRule="auto"/>
+        <w:spacing w:after="60" w:before="0" w:line="278" w:lineRule="auto"/>
       </w:pPr>
       <w:r>
         <w:rPr>
@@ -364,7 +364,7 @@
           <w:i w:val="0"/>
           <w:sz w:val="19"/>
         </w:rPr>
-        <w:t>Automated enrolment, order-punching, and incentive workflows to near-full coverage and revamped the advisor CRM (lead navigation, calling, revenue and target tracking) — cutting operations workload 80% and saving Rs 1.6L/month.</w:t>
+        <w:t>Automated customer enrolment verification and incentive workflows while improving CRM navigation, calling, and revenue tracking — reducing operational workload 80% and saving ~Rs 1.6L/month.</w:t>
       </w:r>
     </w:p>
     <w:p>
@@ -399,7 +399,7 @@
     <w:p>
       <w:pPr>
         <w:pStyle w:val="ListBullet"/>
-        <w:spacing w:after="60" w:before="0" w:line="274" w:lineRule="auto"/>
+        <w:spacing w:after="60" w:before="0" w:line="278" w:lineRule="auto"/>
       </w:pPr>
       <w:r>
         <w:rPr>
@@ -408,13 +408,13 @@
           <w:i w:val="0"/>
           <w:sz w:val="19"/>
         </w:rPr>
-        <w:t>Implemented customer-verification and KYC-style controls that reduced invalid or fraudulent transactions from 10% to 1% while keeping the flow self-serve and low-touch.</w:t>
+        <w:t>Implemented customer and transaction-verification controls that reduced invalid or fraudulent transactions from ~10% to 1% while keeping the flow self-service and low-touch.</w:t>
       </w:r>
     </w:p>
     <w:p>
       <w:pPr>
         <w:pStyle w:val="ListBullet"/>
-        <w:spacing w:after="60" w:before="0" w:line="274" w:lineRule="auto"/>
+        <w:spacing w:after="60" w:before="0" w:line="278" w:lineRule="auto"/>
       </w:pPr>
       <w:r>
         <w:rPr>
@@ -423,7 +423,7 @@
           <w:i w:val="0"/>
           <w:sz w:val="19"/>
         </w:rPr>
-        <w:t>Built SQL and Power BI dashboards (sourced from Metabase queries) giving Marketing, Sales, and Operations self-service visibility into performance and fulfillment metrics.</w:t>
+        <w:t>Built SQL and Power BI dashboards (from Metabase data) giving marketing, sales, and operations teams self-service visibility into performance, revenue, and fulfilment metrics.</w:t>
       </w:r>
     </w:p>
     <w:p>
@@ -446,7 +446,7 @@
     <w:p>
       <w:pPr>
         <w:pStyle w:val="ListBullet"/>
-        <w:spacing w:after="60" w:before="0" w:line="274" w:lineRule="auto"/>
+        <w:spacing w:after="60" w:before="0" w:line="278" w:lineRule="auto"/>
       </w:pPr>
       <w:r>
         <w:rPr>
@@ -455,7 +455,7 @@
           <w:i w:val="0"/>
           <w:sz w:val="19"/>
         </w:rPr>
-        <w:t xml:space="preserve">Data &amp; Analytics: </w:t>
+        <w:t xml:space="preserve">Analytics: </w:t>
       </w:r>
       <w:r>
         <w:rPr>
@@ -464,13 +464,13 @@
           <w:i w:val="0"/>
           <w:sz w:val="19"/>
         </w:rPr>
-        <w:t>SQL, GA4, Power BI, MS Excel (Advanced), Python (basic)</w:t>
+        <w:t>SQL, Power BI, GA4, Advanced Excel, Metabase</w:t>
       </w:r>
     </w:p>
     <w:p>
       <w:pPr>
         <w:pStyle w:val="ListBullet"/>
-        <w:spacing w:after="60" w:before="0" w:line="274" w:lineRule="auto"/>
+        <w:spacing w:after="60" w:before="0" w:line="278" w:lineRule="auto"/>
       </w:pPr>
       <w:r>
         <w:rPr>
@@ -479,7 +479,7 @@
           <w:i w:val="0"/>
           <w:sz w:val="19"/>
         </w:rPr>
-        <w:t xml:space="preserve">Product &amp; Delivery: </w:t>
+        <w:t xml:space="preserve">Product: </w:t>
       </w:r>
       <w:r>
         <w:rPr>
@@ -488,13 +488,13 @@
           <w:i w:val="0"/>
           <w:sz w:val="19"/>
         </w:rPr>
-        <w:t>JIRA, Confluence, Agile/Scrum, RICE prioritization, Figma</w:t>
+        <w:t>JIRA, Confluence, Figma, RICE, Agile/Scrum</w:t>
       </w:r>
     </w:p>
     <w:p>
       <w:pPr>
         <w:pStyle w:val="ListBullet"/>
-        <w:spacing w:after="60" w:before="0" w:line="274" w:lineRule="auto"/>
+        <w:spacing w:after="60" w:before="0" w:line="278" w:lineRule="auto"/>
       </w:pPr>
       <w:r>
         <w:rPr>
@@ -503,7 +503,7 @@
           <w:i w:val="0"/>
           <w:sz w:val="19"/>
         </w:rPr>
-        <w:t xml:space="preserve">AI &amp; Integration: </w:t>
+        <w:t xml:space="preserve">AI &amp; Automation: </w:t>
       </w:r>
       <w:r>
         <w:rPr>
@@ -512,7 +512,31 @@
           <w:i w:val="0"/>
           <w:sz w:val="19"/>
         </w:rPr>
-        <w:t>OpenAI / Gemini / Claude APIs, Claude Code, Prompt Engineering, RAG, REST APIs, Payment Integrations</w:t>
+        <w:t>Claude Code, LLM APIs, RAG, Prompt Engineering, Workflow Automation</w:t>
+      </w:r>
+    </w:p>
+    <w:p>
+      <w:pPr>
+        <w:pStyle w:val="ListBullet"/>
+        <w:spacing w:after="60" w:before="0" w:line="278" w:lineRule="auto"/>
+      </w:pPr>
+      <w:r>
+        <w:rPr>
+          <w:rFonts w:ascii="Calibri" w:hAnsi="Calibri"/>
+          <w:b/>
+          <w:i w:val="0"/>
+          <w:sz w:val="19"/>
+        </w:rPr>
+        <w:t xml:space="preserve">Platforms &amp; Integrations: </w:t>
+      </w:r>
+      <w:r>
+        <w:rPr>
+          <w:rFonts w:ascii="Calibri" w:hAnsi="Calibri"/>
+          <w:b w:val="0"/>
+          <w:i w:val="0"/>
+          <w:sz w:val="19"/>
+        </w:rPr>
+        <w:t>REST APIs, Payment Gateway Integrations</w:t>
       </w:r>
     </w:p>
     <w:p>
@@ -572,7 +596,7 @@
           <w:color w:val="444444"/>
           <w:sz w:val="19"/>
         </w:rPr>
-        <w:t>Product Management Certification — Udemy (2024)    •    JIRA Certification — Udemy (2024)</w:t>
+        <w:t>Product Management Certification — Udemy (2024)    •    Portfolio: kshitizyadav788-svg.github.io/career-dashboard/portfolio.html</w:t>
       </w:r>
     </w:p>
     <w:sectPr>
@@ -949,7 +973,7 @@
     <w:qFormat/>
     <w:rsid w:val="00FC693F"/>
     <w:pPr>
-      <w:spacing w:after="60" w:before="0" w:line="274" w:lineRule="auto"/>
+      <w:spacing w:after="60" w:before="0" w:line="278" w:lineRule="auto"/>
     </w:pPr>
     <w:rPr>
       <w:rFonts w:ascii="Calibri" w:hAnsi="Calibri"/>
@@ -1482,7 +1506,7 @@
       <w:numPr>
         <w:numId w:val="1"/>
       </w:numPr>
-      <w:spacing w:after="60" w:before="0" w:line="274" w:lineRule="auto"/>
+      <w:spacing w:after="60" w:before="0" w:line="278" w:lineRule="auto"/>
       <w:contextualSpacing/>
     </w:pPr>
     <w:rPr>

</xml_diff>